<commit_message>
fix of the Resume
</commit_message>
<xml_diff>
--- a/images/VAangel_bargola_resume.docx
+++ b/images/VAangel_bargola_resume.docx
@@ -1,382 +1,589 @@
 
 <file path=word/document.xml><?xml version="1.0" encoding="utf-8"?>
-<w:document xmlns:wpc="http://schemas.microsoft.com/office/word/2010/wordprocessingCanvas" xmlns:cx="http://schemas.microsoft.com/office/drawing/2014/chartex" xmlns:cx1="http://schemas.microsoft.com/office/drawing/2015/9/8/chartex" xmlns:cx2="http://schemas.microsoft.com/office/drawing/2015/10/21/chartex" xmlns:cx3="http://schemas.microsoft.com/office/drawing/2016/5/9/chartex" xmlns:cx4="http://schemas.microsoft.com/office/drawing/2016/5/10/chartex" xmlns:cx5="http://schemas.microsoft.com/office/drawing/2016/5/11/chartex" xmlns:cx6="http://schemas.microsoft.com/office/drawing/2016/5/12/chartex" xmlns:cx7="http://schemas.microsoft.com/office/drawing/2016/5/13/chartex" xmlns:cx8="http://schemas.microsoft.com/office/drawing/2016/5/14/chartex" xmlns:mc="http://schemas.openxmlformats.org/markup-compatibility/2006" xmlns:aink="http://schemas.microsoft.com/office/drawing/2016/ink" xmlns:am3d="http://schemas.microsoft.com/office/drawing/2017/model3d" xmlns:o="urn:schemas-microsoft-com:office:office" xmlns:oel="http://schemas.microsoft.com/office/2019/extlst" xmlns:r="http://schemas.openxmlformats.org/officeDocument/2006/relationships" xmlns:m="http://schemas.openxmlformats.org/officeDocument/2006/math" xmlns:v="urn:schemas-microsoft-com:vml" xmlns:wp14="http://schemas.microsoft.com/office/word/2010/wordprocessingDrawing" xmlns:wp="http://schemas.openxmlformats.org/drawingml/2006/wordprocessingDrawing" xmlns:w10="urn:schemas-microsoft-com:office:word" xmlns:w="http://schemas.openxmlformats.org/wordprocessingml/2006/main" xmlns:w14="http://schemas.microsoft.com/office/word/2010/wordml" xmlns:w15="http://schemas.microsoft.com/office/word/2012/wordml" xmlns:w16cex="http://schemas.microsoft.com/office/word/2018/wordml/cex" xmlns:w16cid="http://schemas.microsoft.com/office/word/2016/wordml/cid" xmlns:w16="http://schemas.microsoft.com/office/word/2018/wordml" xmlns:w16du="http://schemas.microsoft.com/office/word/2023/wordml/word16du" xmlns:w16sdtdh="http://schemas.microsoft.com/office/word/2020/wordml/sdtdatahash" xmlns:w16se="http://schemas.microsoft.com/office/word/2015/wordml/symex" xmlns:wpg="http://schemas.microsoft.com/office/word/2010/wordprocessingGroup" xmlns:wpi="http://schemas.microsoft.com/office/word/2010/wordprocessingInk" xmlns:wne="http://schemas.microsoft.com/office/word/2006/wordml" xmlns:wps="http://schemas.microsoft.com/office/word/2010/wordprocessingShape" mc:Ignorable="w14 w15 w16se w16cid w16 w16cex w16sdtdh w16du wp14">
+<w:document xmlns:wpc="http://schemas.microsoft.com/office/word/2010/wordprocessingCanvas" xmlns:cx="http://schemas.microsoft.com/office/drawing/2014/chartex" xmlns:cx1="http://schemas.microsoft.com/office/drawing/2015/9/8/chartex" xmlns:cx2="http://schemas.microsoft.com/office/drawing/2015/10/21/chartex" xmlns:cx3="http://schemas.microsoft.com/office/drawing/2016/5/9/chartex" xmlns:cx4="http://schemas.microsoft.com/office/drawing/2016/5/10/chartex" xmlns:cx5="http://schemas.microsoft.com/office/drawing/2016/5/11/chartex" xmlns:cx6="http://schemas.microsoft.com/office/drawing/2016/5/12/chartex" xmlns:cx7="http://schemas.microsoft.com/office/drawing/2016/5/13/chartex" xmlns:cx8="http://schemas.microsoft.com/office/drawing/2016/5/14/chartex" xmlns:mc="http://schemas.openxmlformats.org/markup-compatibility/2006" xmlns:aink="http://schemas.microsoft.com/office/drawing/2016/ink" xmlns:am3d="http://schemas.microsoft.com/office/drawing/2017/model3d" xmlns:o="urn:schemas-microsoft-com:office:office" xmlns:oel="http://schemas.microsoft.com/office/2019/extlst" xmlns:r="http://schemas.openxmlformats.org/officeDocument/2006/relationships" xmlns:m="http://schemas.openxmlformats.org/officeDocument/2006/math" xmlns:v="urn:schemas-microsoft-com:vml" xmlns:wp14="http://schemas.microsoft.com/office/word/2010/wordprocessingDrawing" xmlns:wp="http://schemas.openxmlformats.org/drawingml/2006/wordprocessingDrawing" xmlns:w10="urn:schemas-microsoft-com:office:word" xmlns:w="http://schemas.openxmlformats.org/wordprocessingml/2006/main" xmlns:w14="http://schemas.microsoft.com/office/word/2010/wordml" xmlns:w15="http://schemas.microsoft.com/office/word/2012/wordml" xmlns:w16cex="http://schemas.microsoft.com/office/word/2018/wordml/cex" xmlns:w16cid="http://schemas.microsoft.com/office/word/2016/wordml/cid" xmlns:w16="http://schemas.microsoft.com/office/word/2018/wordml" xmlns:w16du="http://schemas.microsoft.com/office/word/2023/wordml/word16du" xmlns:w16sdtdh="http://schemas.microsoft.com/office/word/2020/wordml/sdtdatahash" xmlns:w16sdtfl="http://schemas.microsoft.com/office/word/2024/wordml/sdtformatlock" xmlns:w16se="http://schemas.microsoft.com/office/word/2015/wordml/symex" xmlns:wpg="http://schemas.microsoft.com/office/word/2010/wordprocessingGroup" xmlns:wpi="http://schemas.microsoft.com/office/word/2010/wordprocessingInk" xmlns:wne="http://schemas.microsoft.com/office/word/2006/wordml" xmlns:wps="http://schemas.microsoft.com/office/word/2010/wordprocessingShape" mc:Ignorable="w14 w15 w16se w16cid w16 w16cex w16sdtdh w16sdtfl w16du wp14">
   <w:body>
     <w:p>
       <w:pPr>
+        <w:pStyle w:val="Title"/>
+        <w:rPr>
+          <w:rFonts w:ascii="Arial" w:hAnsi="Arial" w:cs="Arial"/>
+          <w:sz w:val="22"/>
+          <w:szCs w:val="22"/>
+        </w:rPr>
+      </w:pPr>
+      <w:r>
+        <w:rPr>
+          <w:rFonts w:ascii="Arial" w:hAnsi="Arial" w:cs="Arial"/>
+          <w:sz w:val="22"/>
+          <w:szCs w:val="22"/>
+        </w:rPr>
+        <w:t>ANGEL BARGOLA</w:t>
+      </w:r>
+    </w:p>
+    <w:p>
+      <w:pPr>
+        <w:spacing w:before="100" w:beforeAutospacing="1" w:after="100" w:afterAutospacing="1"/>
+        <w:jc w:val="center"/>
+        <w:rPr>
+          <w:rFonts w:ascii="Arial" w:hAnsi="Arial" w:cs="Arial"/>
+          <w:sz w:val="22"/>
+          <w:szCs w:val="22"/>
+        </w:rPr>
+      </w:pPr>
+      <w:r>
+        <w:rPr>
+          <w:rFonts w:ascii="Arial" w:hAnsi="Arial" w:cs="Arial"/>
+          <w:sz w:val="22"/>
+          <w:szCs w:val="22"/>
+        </w:rPr>
+        <w:t>Imus City, Cavite | 0955-284-1125 | va.angelbargola@gmail.com</w:t>
+      </w:r>
+      <w:r>
+        <w:rPr>
+          <w:rFonts w:ascii="Arial" w:hAnsi="Arial" w:cs="Arial"/>
+          <w:sz w:val="21"/>
+          <w:szCs w:val="21"/>
+        </w:rPr>
+        <w:t xml:space="preserve"> | Portfolio: web-portfolio-</w:t>
+      </w:r>
+      <w:proofErr w:type="spellStart"/>
+      <w:r>
+        <w:rPr>
+          <w:rFonts w:ascii="Arial" w:hAnsi="Arial" w:cs="Arial"/>
+          <w:sz w:val="21"/>
+          <w:szCs w:val="21"/>
+        </w:rPr>
+        <w:t>va</w:t>
+      </w:r>
+      <w:proofErr w:type="spellEnd"/>
+      <w:r>
+        <w:rPr>
+          <w:rFonts w:ascii="Arial" w:hAnsi="Arial" w:cs="Arial"/>
+          <w:sz w:val="21"/>
+          <w:szCs w:val="21"/>
+        </w:rPr>
+        <w:t>-git-main-</w:t>
+      </w:r>
+      <w:proofErr w:type="spellStart"/>
+      <w:r>
+        <w:rPr>
+          <w:rFonts w:ascii="Arial" w:hAnsi="Arial" w:cs="Arial"/>
+          <w:sz w:val="21"/>
+          <w:szCs w:val="21"/>
+        </w:rPr>
+        <w:t>angee.vercel.app</w:t>
+      </w:r>
+      <w:proofErr w:type="spellEnd"/>
+    </w:p>
+    <w:p>
+      <w:pPr>
+        <w:spacing w:before="100" w:beforeAutospacing="1" w:after="100" w:afterAutospacing="1"/>
+        <w:jc w:val="center"/>
+        <w:rPr>
+          <w:rFonts w:ascii="Arial" w:hAnsi="Arial" w:cs="Arial"/>
+          <w:sz w:val="22"/>
+          <w:szCs w:val="22"/>
+        </w:rPr>
+      </w:pPr>
+      <w:r>
+        <w:rPr>
+          <w:rFonts w:ascii="Arial" w:hAnsi="Arial" w:cs="Arial"/>
+          <w:sz w:val="22"/>
+          <w:szCs w:val="22"/>
+        </w:rPr>
+        <w:t>Virtual Assistant | Data Entry Specialist | Administrative Support</w:t>
+      </w:r>
+    </w:p>
+    <w:p>
+      <w:pPr>
         <w:pStyle w:val="Heading1"/>
-      </w:pPr>
-      <w:bookmarkStart w:id="0" w:name="angel-bargola"/>
-      <w:r>
-        <w:t>ANGEL BARGOLA</w:t>
-      </w:r>
-    </w:p>
-    <w:p>
-      <w:pPr>
-        <w:pStyle w:val="FirstParagraph"/>
-      </w:pPr>
-      <w:r>
-        <w:t xml:space="preserve">Virtual Assistant | Data Entry &amp; Administrative Specialist </w:t>
-      </w:r>
-      <w:r>
-        <w:t xml:space="preserve">| </w:t>
-      </w:r>
-      <w:r>
-        <w:t xml:space="preserve">Imus City, Cavite </w:t>
-      </w:r>
-    </w:p>
-    <w:p>
-      <w:pPr>
-        <w:pStyle w:val="FirstParagraph"/>
-      </w:pPr>
-      <w:r>
-        <w:t xml:space="preserve">| 0955-284-1125 | </w:t>
-      </w:r>
-      <w:r>
-        <w:t>va.angelbargola@gmail.com</w:t>
-      </w:r>
-    </w:p>
-    <w:p>
-      <w:pPr>
-        <w:pStyle w:val="Heading3"/>
-      </w:pPr>
-      <w:bookmarkStart w:id="1" w:name="professional-summary"/>
-      <w:r>
+        <w:rPr>
+          <w:rFonts w:ascii="Arial" w:hAnsi="Arial" w:cs="Arial"/>
+          <w:sz w:val="22"/>
+          <w:szCs w:val="22"/>
+        </w:rPr>
+      </w:pPr>
+      <w:r>
+        <w:rPr>
+          <w:rFonts w:ascii="Arial" w:hAnsi="Arial" w:cs="Arial"/>
+          <w:sz w:val="22"/>
+          <w:szCs w:val="22"/>
+        </w:rPr>
         <w:t>PROFESSIONAL SUMMARY</w:t>
       </w:r>
     </w:p>
     <w:p>
       <w:pPr>
-        <w:pStyle w:val="FirstParagraph"/>
-      </w:pPr>
-      <w:r>
-        <w:t xml:space="preserve">Highly organized and detail-oriented professional with proven experience in administrative support, data encoding, and customer service. Adept at managing workflows, optimizing data processes, and serving as a central point of contact. Leverages digital tools and </w:t>
-      </w:r>
-      <w:r>
-        <w:rPr>
-          <w:b/>
-          <w:bCs/>
-        </w:rPr>
-        <w:t>knowledgeable in various AI tools</w:t>
-      </w:r>
-      <w:r>
-        <w:t xml:space="preserve"> for accurate record-keeping, streamlined operations, and exceptional client support, with a strong background in automation and data management.</w:t>
-      </w:r>
-    </w:p>
-    <w:p>
-      <w:pPr>
-        <w:pStyle w:val="Heading3"/>
-      </w:pPr>
-      <w:bookmarkStart w:id="2" w:name="core-competencies"/>
-      <w:bookmarkEnd w:id="1"/>
-      <w:r>
-        <w:t>CORE COMPETENCIES</w:t>
-      </w:r>
-    </w:p>
-    <w:p>
-      <w:pPr>
-        <w:pStyle w:val="FirstParagraph"/>
-      </w:pPr>
-      <w:r>
-        <w:t xml:space="preserve">Data Entry &amp; Database Management | Administrative Support | Customer Service | Workflow Automation | Cross-Functional Communication | </w:t>
-      </w:r>
-      <w:r>
-        <w:rPr>
-          <w:b/>
-          <w:bCs/>
-        </w:rPr>
-        <w:t>AI Tool Proficiency</w:t>
-      </w:r>
-    </w:p>
-    <w:p>
-      <w:pPr>
-        <w:pStyle w:val="Heading3"/>
-      </w:pPr>
-      <w:bookmarkStart w:id="3" w:name="technical-skills-tools"/>
-      <w:bookmarkEnd w:id="2"/>
-      <w:r>
-        <w:t>TECHNICAL SKILLS &amp; TOOLS</w:t>
-      </w:r>
-    </w:p>
-    <w:p>
-      <w:pPr>
-        <w:pStyle w:val="Compact"/>
+        <w:spacing w:before="100" w:beforeAutospacing="1" w:after="100" w:afterAutospacing="1"/>
+        <w:rPr>
+          <w:rFonts w:ascii="Arial" w:hAnsi="Arial" w:cs="Arial"/>
+          <w:sz w:val="22"/>
+          <w:szCs w:val="22"/>
+        </w:rPr>
+      </w:pPr>
+      <w:r>
+        <w:rPr>
+          <w:rFonts w:ascii="Arial" w:hAnsi="Arial" w:cs="Arial"/>
+          <w:sz w:val="22"/>
+          <w:szCs w:val="22"/>
+        </w:rPr>
+        <w:t>Highly organized Virtual Assistant and Administrative Support professional with experience in data</w:t>
+      </w:r>
+      <w:r>
+        <w:rPr>
+          <w:rFonts w:ascii="Arial" w:hAnsi="Arial" w:cs="Arial"/>
+          <w:sz w:val="22"/>
+          <w:szCs w:val="22"/>
+        </w:rPr>
+        <w:t xml:space="preserve"> entry, customer service, workflow coordination, order validation, reporting, and digital tool management. Skilled in maintaining accurate records, supporting cross-functional communication, improving data processes, and using productivity, automation, and AI-powered tools to streamline daily operations.</w:t>
+      </w:r>
+    </w:p>
+    <w:p>
+      <w:pPr>
+        <w:pStyle w:val="Heading1"/>
+        <w:rPr>
+          <w:rFonts w:ascii="Arial" w:hAnsi="Arial" w:cs="Arial"/>
+          <w:sz w:val="22"/>
+          <w:szCs w:val="22"/>
+        </w:rPr>
+      </w:pPr>
+      <w:r>
+        <w:rPr>
+          <w:rFonts w:ascii="Arial" w:hAnsi="Arial" w:cs="Arial"/>
+          <w:sz w:val="22"/>
+          <w:szCs w:val="22"/>
+        </w:rPr>
+        <w:t>SKILLS</w:t>
+      </w:r>
+    </w:p>
+    <w:p>
+      <w:pPr>
+        <w:spacing w:before="100" w:beforeAutospacing="1" w:after="100" w:afterAutospacing="1"/>
+        <w:rPr>
+          <w:rFonts w:ascii="Arial" w:hAnsi="Arial" w:cs="Arial"/>
+          <w:sz w:val="22"/>
+          <w:szCs w:val="22"/>
+        </w:rPr>
+      </w:pPr>
+      <w:r>
+        <w:rPr>
+          <w:rFonts w:ascii="Arial" w:hAnsi="Arial" w:cs="Arial"/>
+          <w:sz w:val="22"/>
+          <w:szCs w:val="22"/>
+        </w:rPr>
+        <w:t>Administrative Support | Data Entry | Database Management | Order Validation | Customer Service | Email and Chat Support | Workflow Coordination | Reporting | KPI Tracking | SOP Development | Marketing Automation | Cross-Functional Communication | AI Tool Proficiency</w:t>
+      </w:r>
+    </w:p>
+    <w:p>
+      <w:pPr>
+        <w:pStyle w:val="Heading1"/>
+        <w:rPr>
+          <w:rFonts w:ascii="Arial" w:hAnsi="Arial" w:cs="Arial"/>
+          <w:sz w:val="22"/>
+          <w:szCs w:val="22"/>
+        </w:rPr>
+      </w:pPr>
+      <w:r>
+        <w:rPr>
+          <w:rFonts w:ascii="Arial" w:hAnsi="Arial" w:cs="Arial"/>
+          <w:sz w:val="22"/>
+          <w:szCs w:val="22"/>
+        </w:rPr>
+        <w:t>TOOLS AND TECHNOLOGIES</w:t>
+      </w:r>
+    </w:p>
+    <w:p>
+      <w:pPr>
+        <w:pStyle w:val="ListParagraph"/>
         <w:numPr>
           <w:ilvl w:val="0"/>
-          <w:numId w:val="2"/>
+          <w:numId w:val="3"/>
         </w:numPr>
       </w:pPr>
       <w:r>
         <w:rPr>
-          <w:b/>
-          <w:bCs/>
-        </w:rPr>
-        <w:t>Productivity:</w:t>
-      </w:r>
-      <w:r>
-        <w:t xml:space="preserve"> Google Workspace (Sheets, Drive, Gmail), Microsoft Office (Word, Excel)</w:t>
-      </w:r>
-    </w:p>
-    <w:p>
-      <w:pPr>
-        <w:pStyle w:val="Compact"/>
+          <w:rFonts w:ascii="Arial" w:hAnsi="Arial" w:cs="Arial"/>
+          <w:sz w:val="22"/>
+          <w:szCs w:val="22"/>
+        </w:rPr>
+        <w:t>Google Workspace: Google Sheets, Google Drive, Gmail</w:t>
+      </w:r>
+    </w:p>
+    <w:p>
+      <w:pPr>
+        <w:pStyle w:val="ListParagraph"/>
         <w:numPr>
           <w:ilvl w:val="0"/>
-          <w:numId w:val="2"/>
+          <w:numId w:val="3"/>
         </w:numPr>
       </w:pPr>
       <w:r>
         <w:rPr>
-          <w:b/>
-          <w:bCs/>
-        </w:rPr>
-        <w:t>Marketing &amp; Automation:</w:t>
-      </w:r>
-      <w:r>
-        <w:t xml:space="preserve"> Meta Business Suite, Facebook Messenger, Botcake, Pancake</w:t>
-      </w:r>
-    </w:p>
-    <w:p>
-      <w:pPr>
-        <w:pStyle w:val="Compact"/>
+          <w:rFonts w:ascii="Arial" w:hAnsi="Arial" w:cs="Arial"/>
+          <w:sz w:val="22"/>
+          <w:szCs w:val="22"/>
+        </w:rPr>
+        <w:t>Microsoft Office: Word, Excel</w:t>
+      </w:r>
+    </w:p>
+    <w:p>
+      <w:pPr>
+        <w:pStyle w:val="ListParagraph"/>
         <w:numPr>
           <w:ilvl w:val="0"/>
-          <w:numId w:val="2"/>
+          <w:numId w:val="3"/>
         </w:numPr>
       </w:pPr>
       <w:r>
         <w:rPr>
-          <w:b/>
-          <w:bCs/>
-        </w:rPr>
-        <w:t>AI Tools:</w:t>
-      </w:r>
-      <w:r>
-        <w:t xml:space="preserve"> Knowledgeable in various AI-powered platforms for enhanced productivity and task automation.</w:t>
-      </w:r>
-    </w:p>
-    <w:p>
-      <w:pPr>
-        <w:pStyle w:val="Compact"/>
+          <w:rFonts w:ascii="Arial" w:hAnsi="Arial" w:cs="Arial"/>
+          <w:sz w:val="22"/>
+          <w:szCs w:val="22"/>
+        </w:rPr>
+        <w:t xml:space="preserve">Marketing and Automation: Meta Business Suite, Facebook Messenger, </w:t>
+      </w:r>
+      <w:proofErr w:type="spellStart"/>
+      <w:r>
+        <w:rPr>
+          <w:rFonts w:ascii="Arial" w:hAnsi="Arial" w:cs="Arial"/>
+          <w:sz w:val="22"/>
+          <w:szCs w:val="22"/>
+        </w:rPr>
+        <w:t>Botcake</w:t>
+      </w:r>
+      <w:proofErr w:type="spellEnd"/>
+      <w:r>
+        <w:rPr>
+          <w:rFonts w:ascii="Arial" w:hAnsi="Arial" w:cs="Arial"/>
+          <w:sz w:val="22"/>
+          <w:szCs w:val="22"/>
+        </w:rPr>
+        <w:t>, Pancake</w:t>
+      </w:r>
+    </w:p>
+    <w:p>
+      <w:pPr>
+        <w:pStyle w:val="ListParagraph"/>
         <w:numPr>
           <w:ilvl w:val="0"/>
-          <w:numId w:val="2"/>
+          <w:numId w:val="3"/>
         </w:numPr>
       </w:pPr>
       <w:r>
         <w:rPr>
-          <w:b/>
-          <w:bCs/>
-        </w:rPr>
-        <w:t>Design &amp; Communication:</w:t>
-      </w:r>
-      <w:r>
-        <w:t xml:space="preserve"> Canva, Viber</w:t>
-      </w:r>
-      <w:r>
-        <w:t>, Microsoft Teams, Telegram</w:t>
-      </w:r>
-    </w:p>
-    <w:p>
-      <w:pPr>
-        <w:pStyle w:val="Compact"/>
+          <w:rFonts w:ascii="Arial" w:hAnsi="Arial" w:cs="Arial"/>
+          <w:sz w:val="22"/>
+          <w:szCs w:val="22"/>
+        </w:rPr>
+        <w:t>Design and Communication: Canva, Viber, Microsoft Teams, Telegram</w:t>
+      </w:r>
+    </w:p>
+    <w:p>
+      <w:pPr>
+        <w:pStyle w:val="ListParagraph"/>
         <w:numPr>
           <w:ilvl w:val="0"/>
-          <w:numId w:val="2"/>
+          <w:numId w:val="3"/>
         </w:numPr>
       </w:pPr>
       <w:r>
         <w:rPr>
-          <w:b/>
-          <w:bCs/>
-        </w:rPr>
-        <w:t>Typing Speed:</w:t>
-      </w:r>
-      <w:r>
-        <w:t xml:space="preserve"> 45 WPM | </w:t>
-      </w:r>
-      <w:r>
-        <w:rPr>
-          <w:b/>
-          <w:bCs/>
-        </w:rPr>
-        <w:t>Languages:</w:t>
-      </w:r>
-      <w:r>
-        <w:t xml:space="preserve"> Fluent in English and Filipino</w:t>
-      </w:r>
-    </w:p>
-    <w:p>
-      <w:pPr>
-        <w:pStyle w:val="Heading3"/>
-      </w:pPr>
-      <w:bookmarkStart w:id="4" w:name="professional-experience"/>
-      <w:bookmarkEnd w:id="3"/>
-      <w:r>
-        <w:t>PROFESSIONAL EXPERIENCE</w:t>
-      </w:r>
-    </w:p>
-    <w:p>
-      <w:pPr>
-        <w:pStyle w:val="FirstParagraph"/>
-      </w:pPr>
-      <w:r>
-        <w:rPr>
-          <w:b/>
-          <w:bCs/>
-        </w:rPr>
-        <w:t>Point of Contact (POC) / Company Admin</w:t>
-      </w:r>
-      <w:r>
-        <w:t xml:space="preserve"> (Previously Automation Specialist &amp; Encoder) </w:t>
+          <w:rFonts w:ascii="Arial" w:hAnsi="Arial" w:cs="Arial"/>
+          <w:sz w:val="22"/>
+          <w:szCs w:val="22"/>
+        </w:rPr>
+        <w:t>Languages: English and Filipino</w:t>
+      </w:r>
+    </w:p>
+    <w:p>
+      <w:pPr>
+        <w:pStyle w:val="Heading1"/>
+        <w:rPr>
+          <w:rFonts w:ascii="Arial" w:hAnsi="Arial" w:cs="Arial"/>
+          <w:sz w:val="22"/>
+          <w:szCs w:val="22"/>
+        </w:rPr>
+      </w:pPr>
+      <w:r>
+        <w:rPr>
+          <w:rFonts w:ascii="Arial" w:hAnsi="Arial" w:cs="Arial"/>
+          <w:sz w:val="22"/>
+          <w:szCs w:val="22"/>
+        </w:rPr>
+        <w:t>WORK EXPERIENCE</w:t>
+      </w:r>
+    </w:p>
+    <w:p>
+      <w:pPr>
+        <w:spacing w:before="100" w:beforeAutospacing="1" w:after="100" w:afterAutospacing="1"/>
+        <w:rPr>
+          <w:rFonts w:ascii="Arial" w:hAnsi="Arial" w:cs="Arial"/>
+          <w:sz w:val="22"/>
+          <w:szCs w:val="22"/>
+        </w:rPr>
+      </w:pPr>
+      <w:r>
+        <w:rPr>
+          <w:rFonts w:ascii="Arial" w:hAnsi="Arial" w:cs="Arial"/>
+          <w:sz w:val="22"/>
+          <w:szCs w:val="22"/>
+        </w:rPr>
+        <w:t xml:space="preserve">Point of Contact (POC) / Company Admin | </w:t>
       </w:r>
       <w:proofErr w:type="spellStart"/>
       <w:r>
+        <w:rPr>
+          <w:rFonts w:ascii="Arial" w:hAnsi="Arial" w:cs="Arial"/>
+          <w:sz w:val="22"/>
+          <w:szCs w:val="22"/>
+        </w:rPr>
         <w:t>Sellsquad</w:t>
       </w:r>
       <w:proofErr w:type="spellEnd"/>
       <w:r>
-        <w:t xml:space="preserve"> Digital Marketing Inc.</w:t>
-      </w:r>
-      <w:r>
-        <w:t xml:space="preserve"> | </w:t>
-      </w:r>
-      <w:r>
-        <w:t>April 2025-July 2026</w:t>
-      </w:r>
-      <w:r>
-        <w:t xml:space="preserve"> </w:t>
-      </w:r>
-    </w:p>
-    <w:p>
-      <w:pPr>
-        <w:pStyle w:val="FirstParagraph"/>
-      </w:pPr>
-      <w:r>
-        <w:t xml:space="preserve">- Managed administrative and operational tasks: data encoding, order validation, system management. </w:t>
-      </w:r>
-    </w:p>
-    <w:p>
-      <w:pPr>
-        <w:pStyle w:val="FirstParagraph"/>
-      </w:pPr>
-      <w:r>
-        <w:t xml:space="preserve">- Optimized data processes using Google Sheets/Drive for reporting, KPIs, and workflow efficiency. </w:t>
-      </w:r>
-    </w:p>
-    <w:p>
-      <w:pPr>
-        <w:pStyle w:val="FirstParagraph"/>
-      </w:pPr>
-      <w:r>
-        <w:t xml:space="preserve">- Served as central POC, coordinating communication across Marketing, Operations, Support, and </w:t>
+        <w:rPr>
+          <w:rFonts w:ascii="Arial" w:hAnsi="Arial" w:cs="Arial"/>
+          <w:sz w:val="22"/>
+          <w:szCs w:val="22"/>
+        </w:rPr>
+        <w:t xml:space="preserve"> Digital Marketing Inc. | April 2025 - July</w:t>
+      </w:r>
+      <w:r>
+        <w:rPr>
+          <w:rFonts w:ascii="Arial" w:hAnsi="Arial" w:cs="Arial"/>
+          <w:sz w:val="22"/>
+          <w:szCs w:val="22"/>
+        </w:rPr>
+        <w:t xml:space="preserve"> 2026</w:t>
+      </w:r>
+    </w:p>
+    <w:p>
+      <w:pPr>
+        <w:pStyle w:val="ListParagraph"/>
+        <w:numPr>
+          <w:ilvl w:val="0"/>
+          <w:numId w:val="4"/>
+        </w:numPr>
+      </w:pPr>
+      <w:r>
+        <w:rPr>
+          <w:rFonts w:ascii="Arial" w:hAnsi="Arial" w:cs="Arial"/>
+          <w:sz w:val="22"/>
+          <w:szCs w:val="22"/>
+        </w:rPr>
+        <w:t>Managed administrative and operational tasks, including data encoding, order validation, system updates, and daily workflow coordination.</w:t>
+      </w:r>
+    </w:p>
+    <w:p>
+      <w:pPr>
+        <w:pStyle w:val="ListParagraph"/>
+        <w:numPr>
+          <w:ilvl w:val="0"/>
+          <w:numId w:val="4"/>
+        </w:numPr>
+      </w:pPr>
+      <w:r>
+        <w:rPr>
+          <w:rFonts w:ascii="Arial" w:hAnsi="Arial" w:cs="Arial"/>
+          <w:sz w:val="22"/>
+          <w:szCs w:val="22"/>
+        </w:rPr>
+        <w:t>Optimized data processes using Google Sheets and Google Drive to support reporting, KPI tracking, and workflow efficiency.</w:t>
+      </w:r>
+    </w:p>
+    <w:p>
+      <w:pPr>
+        <w:pStyle w:val="ListParagraph"/>
+        <w:numPr>
+          <w:ilvl w:val="0"/>
+          <w:numId w:val="4"/>
+        </w:numPr>
+      </w:pPr>
+      <w:r>
+        <w:rPr>
+          <w:rFonts w:ascii="Arial" w:hAnsi="Arial" w:cs="Arial"/>
+          <w:sz w:val="22"/>
+          <w:szCs w:val="22"/>
+        </w:rPr>
+        <w:t xml:space="preserve">Served as the central point of contact for Marketing, Operations, Support, and </w:t>
       </w:r>
       <w:proofErr w:type="gramStart"/>
       <w:r>
+        <w:rPr>
+          <w:rFonts w:ascii="Arial" w:hAnsi="Arial" w:cs="Arial"/>
+          <w:sz w:val="22"/>
+          <w:szCs w:val="22"/>
+        </w:rPr>
         <w:t>Technical</w:t>
       </w:r>
       <w:proofErr w:type="gramEnd"/>
       <w:r>
-        <w:t xml:space="preserve"> teams. </w:t>
-      </w:r>
-    </w:p>
-    <w:p>
-      <w:pPr>
-        <w:pStyle w:val="FirstParagraph"/>
-      </w:pPr>
-      <w:r>
-        <w:t>- Developed SOPs and managed end-to-end marketing automation (Messenger sequences, broadcast campaigns).</w:t>
-      </w:r>
-    </w:p>
-    <w:p>
-      <w:pPr>
-        <w:pStyle w:val="BodyText"/>
-      </w:pPr>
-    </w:p>
-    <w:p>
-      <w:pPr>
-        <w:pStyle w:val="BodyText"/>
-      </w:pPr>
-      <w:r>
-        <w:rPr>
-          <w:b/>
-          <w:bCs/>
-        </w:rPr>
-        <w:t>Customer Service Representative</w:t>
-      </w:r>
-      <w:r>
-        <w:t xml:space="preserve"> </w:t>
-      </w:r>
-    </w:p>
-    <w:p>
-      <w:pPr>
-        <w:pStyle w:val="BodyText"/>
-      </w:pPr>
+        <w:rPr>
+          <w:rFonts w:ascii="Arial" w:hAnsi="Arial" w:cs="Arial"/>
+          <w:sz w:val="22"/>
+          <w:szCs w:val="22"/>
+        </w:rPr>
+        <w:t xml:space="preserve"> teams to ensure accurate and timely communication.</w:t>
+      </w:r>
+    </w:p>
+    <w:p>
+      <w:pPr>
+        <w:pStyle w:val="ListParagraph"/>
+        <w:numPr>
+          <w:ilvl w:val="0"/>
+          <w:numId w:val="4"/>
+        </w:numPr>
+      </w:pPr>
+      <w:r>
+        <w:rPr>
+          <w:rFonts w:ascii="Arial" w:hAnsi="Arial" w:cs="Arial"/>
+          <w:sz w:val="22"/>
+          <w:szCs w:val="22"/>
+        </w:rPr>
+        <w:t>Developed standard operating procedures and supported end-</w:t>
+      </w:r>
+      <w:proofErr w:type="gramStart"/>
+      <w:r>
+        <w:rPr>
+          <w:rFonts w:ascii="Arial" w:hAnsi="Arial" w:cs="Arial"/>
+          <w:sz w:val="22"/>
+          <w:szCs w:val="22"/>
+        </w:rPr>
+        <w:t>to-</w:t>
+      </w:r>
+      <w:proofErr w:type="gramEnd"/>
+      <w:r>
+        <w:rPr>
+          <w:rFonts w:ascii="Arial" w:hAnsi="Arial" w:cs="Arial"/>
+          <w:sz w:val="22"/>
+          <w:szCs w:val="22"/>
+        </w:rPr>
+        <w:t>end marketing automation, including Messenger sequences and broadcast campaigns.</w:t>
+      </w:r>
+    </w:p>
+    <w:p>
+      <w:pPr>
+        <w:spacing w:before="100" w:beforeAutospacing="1" w:after="100" w:afterAutospacing="1"/>
+        <w:rPr>
+          <w:rFonts w:ascii="Arial" w:hAnsi="Arial" w:cs="Arial"/>
+          <w:sz w:val="22"/>
+          <w:szCs w:val="22"/>
+        </w:rPr>
+      </w:pPr>
+      <w:r>
+        <w:rPr>
+          <w:rFonts w:ascii="Arial" w:hAnsi="Arial" w:cs="Arial"/>
+          <w:sz w:val="22"/>
+          <w:szCs w:val="22"/>
+        </w:rPr>
+        <w:t xml:space="preserve">Customer Service Representative | </w:t>
+      </w:r>
       <w:proofErr w:type="spellStart"/>
       <w:r>
+        <w:rPr>
+          <w:rFonts w:ascii="Arial" w:hAnsi="Arial" w:cs="Arial"/>
+          <w:sz w:val="22"/>
+          <w:szCs w:val="22"/>
+        </w:rPr>
         <w:t>Startek</w:t>
       </w:r>
       <w:proofErr w:type="spellEnd"/>
       <w:r>
-        <w:t xml:space="preserve"> | </w:t>
-      </w:r>
-      <w:r>
-        <w:t>October 2022-January 2023</w:t>
-      </w:r>
-      <w:r>
-        <w:t xml:space="preserve"> </w:t>
-      </w:r>
-    </w:p>
-    <w:p>
-      <w:pPr>
-        <w:pStyle w:val="BodyText"/>
-      </w:pPr>
-      <w:r>
-        <w:t xml:space="preserve">- Provided prompt customer support via phone, email, and chat; resolved inquiries and processed transactions. </w:t>
-      </w:r>
-    </w:p>
-    <w:p>
-      <w:pPr>
-        <w:pStyle w:val="BodyText"/>
-      </w:pPr>
-      <w:r>
-        <w:t xml:space="preserve">- Accurately logged interaction details and updated customer accounts. </w:t>
-      </w:r>
-    </w:p>
-    <w:p>
-      <w:pPr>
-        <w:pStyle w:val="BodyText"/>
-      </w:pPr>
-      <w:r>
-        <w:t>- Managed escalation of complex issues to specialized departments for effective resolution.</w:t>
-      </w:r>
-    </w:p>
-    <w:p>
-      <w:pPr>
-        <w:pStyle w:val="Heading3"/>
-      </w:pPr>
-      <w:bookmarkStart w:id="5" w:name="education"/>
-      <w:bookmarkEnd w:id="4"/>
-      <w:r>
+        <w:rPr>
+          <w:rFonts w:ascii="Arial" w:hAnsi="Arial" w:cs="Arial"/>
+          <w:sz w:val="22"/>
+          <w:szCs w:val="22"/>
+        </w:rPr>
+        <w:t xml:space="preserve"> | October 2022 - January 2023</w:t>
+      </w:r>
+    </w:p>
+    <w:p>
+      <w:pPr>
+        <w:pStyle w:val="ListParagraph"/>
+        <w:numPr>
+          <w:ilvl w:val="0"/>
+          <w:numId w:val="5"/>
+        </w:numPr>
+      </w:pPr>
+      <w:r>
+        <w:rPr>
+          <w:rFonts w:ascii="Arial" w:hAnsi="Arial" w:cs="Arial"/>
+          <w:sz w:val="22"/>
+          <w:szCs w:val="22"/>
+        </w:rPr>
+        <w:lastRenderedPageBreak/>
+        <w:t>Provided customer support through phone, email, and chat while resolving inquiries and processing transactions accurately.</w:t>
+      </w:r>
+    </w:p>
+    <w:p>
+      <w:pPr>
+        <w:pStyle w:val="ListParagraph"/>
+        <w:numPr>
+          <w:ilvl w:val="0"/>
+          <w:numId w:val="5"/>
+        </w:numPr>
+      </w:pPr>
+      <w:r>
+        <w:rPr>
+          <w:rFonts w:ascii="Arial" w:hAnsi="Arial" w:cs="Arial"/>
+          <w:sz w:val="22"/>
+          <w:szCs w:val="22"/>
+        </w:rPr>
+        <w:t>Logged customer interaction details, updated account records, and maintained accurate service documentation.</w:t>
+      </w:r>
+    </w:p>
+    <w:p>
+      <w:pPr>
+        <w:pStyle w:val="ListParagraph"/>
+        <w:numPr>
+          <w:ilvl w:val="0"/>
+          <w:numId w:val="5"/>
+        </w:numPr>
+      </w:pPr>
+      <w:r>
+        <w:rPr>
+          <w:rFonts w:ascii="Arial" w:hAnsi="Arial" w:cs="Arial"/>
+          <w:sz w:val="22"/>
+          <w:szCs w:val="22"/>
+        </w:rPr>
+        <w:t>Escalated complex issues to specialized departments to support timely and effective resolution.</w:t>
+      </w:r>
+    </w:p>
+    <w:p>
+      <w:pPr>
+        <w:pStyle w:val="Heading1"/>
+        <w:rPr>
+          <w:rFonts w:ascii="Arial" w:hAnsi="Arial" w:cs="Arial"/>
+          <w:sz w:val="22"/>
+          <w:szCs w:val="22"/>
+        </w:rPr>
+      </w:pPr>
+      <w:r>
+        <w:rPr>
+          <w:rFonts w:ascii="Arial" w:hAnsi="Arial" w:cs="Arial"/>
+          <w:sz w:val="22"/>
+          <w:szCs w:val="22"/>
+        </w:rPr>
         <w:t>EDUCATION</w:t>
       </w:r>
     </w:p>
     <w:p>
       <w:pPr>
-        <w:pStyle w:val="FirstParagraph"/>
-      </w:pPr>
-      <w:r>
-        <w:rPr>
-          <w:b/>
-          <w:bCs/>
-        </w:rPr>
-        <w:t>Senior High School Graduate</w:t>
-      </w:r>
-      <w:r>
-        <w:t xml:space="preserve"> General Flaviano Yengko Senior High School | Graduated: 2021</w:t>
-      </w:r>
-      <w:bookmarkEnd w:id="0"/>
-      <w:bookmarkEnd w:id="5"/>
+        <w:spacing w:before="100" w:beforeAutospacing="1" w:after="100" w:afterAutospacing="1"/>
+        <w:rPr>
+          <w:rFonts w:ascii="Arial" w:hAnsi="Arial" w:cs="Arial"/>
+          <w:sz w:val="22"/>
+          <w:szCs w:val="22"/>
+        </w:rPr>
+      </w:pPr>
+      <w:r>
+        <w:rPr>
+          <w:rFonts w:ascii="Arial" w:hAnsi="Arial" w:cs="Arial"/>
+          <w:sz w:val="22"/>
+          <w:szCs w:val="22"/>
+        </w:rPr>
+        <w:t>Senior High School Graduate | General Flaviano Yengko Senior High School | 2021</w:t>
+      </w:r>
     </w:p>
     <w:sectPr>
       <w:pgSz w:w="12240" w:h="15840"/>
@@ -388,7 +595,7 @@
 </file>
 
 <file path=word/endnotes.xml><?xml version="1.0" encoding="utf-8"?>
-<w:endnotes xmlns:wpc="http://schemas.microsoft.com/office/word/2010/wordprocessingCanvas" xmlns:cx="http://schemas.microsoft.com/office/drawing/2014/chartex" xmlns:cx1="http://schemas.microsoft.com/office/drawing/2015/9/8/chartex" xmlns:cx2="http://schemas.microsoft.com/office/drawing/2015/10/21/chartex" xmlns:cx3="http://schemas.microsoft.com/office/drawing/2016/5/9/chartex" xmlns:cx4="http://schemas.microsoft.com/office/drawing/2016/5/10/chartex" xmlns:cx5="http://schemas.microsoft.com/office/drawing/2016/5/11/chartex" xmlns:cx6="http://schemas.microsoft.com/office/drawing/2016/5/12/chartex" xmlns:cx7="http://schemas.microsoft.com/office/drawing/2016/5/13/chartex" xmlns:cx8="http://schemas.microsoft.com/office/drawing/2016/5/14/chartex" xmlns:mc="http://schemas.openxmlformats.org/markup-compatibility/2006" xmlns:aink="http://schemas.microsoft.com/office/drawing/2016/ink" xmlns:am3d="http://schemas.microsoft.com/office/drawing/2017/model3d" xmlns:o="urn:schemas-microsoft-com:office:office" xmlns:oel="http://schemas.microsoft.com/office/2019/extlst" xmlns:r="http://schemas.openxmlformats.org/officeDocument/2006/relationships" xmlns:m="http://schemas.openxmlformats.org/officeDocument/2006/math" xmlns:v="urn:schemas-microsoft-com:vml" xmlns:wp14="http://schemas.microsoft.com/office/word/2010/wordprocessingDrawing" xmlns:wp="http://schemas.openxmlformats.org/drawingml/2006/wordprocessingDrawing" xmlns:w10="urn:schemas-microsoft-com:office:word" xmlns:w="http://schemas.openxmlformats.org/wordprocessingml/2006/main" xmlns:w14="http://schemas.microsoft.com/office/word/2010/wordml" xmlns:w15="http://schemas.microsoft.com/office/word/2012/wordml" xmlns:w16cex="http://schemas.microsoft.com/office/word/2018/wordml/cex" xmlns:w16cid="http://schemas.microsoft.com/office/word/2016/wordml/cid" xmlns:w16="http://schemas.microsoft.com/office/word/2018/wordml" xmlns:w16du="http://schemas.microsoft.com/office/word/2023/wordml/word16du" xmlns:w16sdtdh="http://schemas.microsoft.com/office/word/2020/wordml/sdtdatahash" xmlns:w16se="http://schemas.microsoft.com/office/word/2015/wordml/symex" xmlns:wpg="http://schemas.microsoft.com/office/word/2010/wordprocessingGroup" xmlns:wpi="http://schemas.microsoft.com/office/word/2010/wordprocessingInk" xmlns:wne="http://schemas.microsoft.com/office/word/2006/wordml" xmlns:wps="http://schemas.microsoft.com/office/word/2010/wordprocessingShape" mc:Ignorable="w14 w15 w16se w16cid w16 w16cex w16sdtdh w16du wp14">
+<w:endnotes xmlns:wpc="http://schemas.microsoft.com/office/word/2010/wordprocessingCanvas" xmlns:cx="http://schemas.microsoft.com/office/drawing/2014/chartex" xmlns:cx1="http://schemas.microsoft.com/office/drawing/2015/9/8/chartex" xmlns:cx2="http://schemas.microsoft.com/office/drawing/2015/10/21/chartex" xmlns:cx3="http://schemas.microsoft.com/office/drawing/2016/5/9/chartex" xmlns:cx4="http://schemas.microsoft.com/office/drawing/2016/5/10/chartex" xmlns:cx5="http://schemas.microsoft.com/office/drawing/2016/5/11/chartex" xmlns:cx6="http://schemas.microsoft.com/office/drawing/2016/5/12/chartex" xmlns:cx7="http://schemas.microsoft.com/office/drawing/2016/5/13/chartex" xmlns:cx8="http://schemas.microsoft.com/office/drawing/2016/5/14/chartex" xmlns:mc="http://schemas.openxmlformats.org/markup-compatibility/2006" xmlns:aink="http://schemas.microsoft.com/office/drawing/2016/ink" xmlns:am3d="http://schemas.microsoft.com/office/drawing/2017/model3d" xmlns:o="urn:schemas-microsoft-com:office:office" xmlns:oel="http://schemas.microsoft.com/office/2019/extlst" xmlns:r="http://schemas.openxmlformats.org/officeDocument/2006/relationships" xmlns:m="http://schemas.openxmlformats.org/officeDocument/2006/math" xmlns:v="urn:schemas-microsoft-com:vml" xmlns:wp14="http://schemas.microsoft.com/office/word/2010/wordprocessingDrawing" xmlns:wp="http://schemas.openxmlformats.org/drawingml/2006/wordprocessingDrawing" xmlns:w10="urn:schemas-microsoft-com:office:word" xmlns:w="http://schemas.openxmlformats.org/wordprocessingml/2006/main" xmlns:w14="http://schemas.microsoft.com/office/word/2010/wordml" xmlns:w15="http://schemas.microsoft.com/office/word/2012/wordml" xmlns:w16cex="http://schemas.microsoft.com/office/word/2018/wordml/cex" xmlns:w16cid="http://schemas.microsoft.com/office/word/2016/wordml/cid" xmlns:w16="http://schemas.microsoft.com/office/word/2018/wordml" xmlns:w16du="http://schemas.microsoft.com/office/word/2023/wordml/word16du" xmlns:w16sdtdh="http://schemas.microsoft.com/office/word/2020/wordml/sdtdatahash" xmlns:w16sdtfl="http://schemas.microsoft.com/office/word/2024/wordml/sdtformatlock" xmlns:w16se="http://schemas.microsoft.com/office/word/2015/wordml/symex" xmlns:wpg="http://schemas.microsoft.com/office/word/2010/wordprocessingGroup" xmlns:wpi="http://schemas.microsoft.com/office/word/2010/wordprocessingInk" xmlns:wne="http://schemas.microsoft.com/office/word/2006/wordml" xmlns:wps="http://schemas.microsoft.com/office/word/2010/wordprocessingShape" mc:Ignorable="w14 w15 w16se w16cid w16 w16cex w16sdtdh w16sdtfl w16du wp14">
   <w:endnote w:type="separator" w:id="-1">
     <w:p>
       <w:pPr>
@@ -413,7 +620,7 @@
 </file>
 
 <file path=word/footnotes.xml><?xml version="1.0" encoding="utf-8"?>
-<w:footnotes xmlns:wpc="http://schemas.microsoft.com/office/word/2010/wordprocessingCanvas" xmlns:cx="http://schemas.microsoft.com/office/drawing/2014/chartex" xmlns:cx1="http://schemas.microsoft.com/office/drawing/2015/9/8/chartex" xmlns:cx2="http://schemas.microsoft.com/office/drawing/2015/10/21/chartex" xmlns:cx3="http://schemas.microsoft.com/office/drawing/2016/5/9/chartex" xmlns:cx4="http://schemas.microsoft.com/office/drawing/2016/5/10/chartex" xmlns:cx5="http://schemas.microsoft.com/office/drawing/2016/5/11/chartex" xmlns:cx6="http://schemas.microsoft.com/office/drawing/2016/5/12/chartex" xmlns:cx7="http://schemas.microsoft.com/office/drawing/2016/5/13/chartex" xmlns:cx8="http://schemas.microsoft.com/office/drawing/2016/5/14/chartex" xmlns:mc="http://schemas.openxmlformats.org/markup-compatibility/2006" xmlns:aink="http://schemas.microsoft.com/office/drawing/2016/ink" xmlns:am3d="http://schemas.microsoft.com/office/drawing/2017/model3d" xmlns:o="urn:schemas-microsoft-com:office:office" xmlns:oel="http://schemas.microsoft.com/office/2019/extlst" xmlns:r="http://schemas.openxmlformats.org/officeDocument/2006/relationships" xmlns:m="http://schemas.openxmlformats.org/officeDocument/2006/math" xmlns:v="urn:schemas-microsoft-com:vml" xmlns:wp14="http://schemas.microsoft.com/office/word/2010/wordprocessingDrawing" xmlns:wp="http://schemas.openxmlformats.org/drawingml/2006/wordprocessingDrawing" xmlns:w10="urn:schemas-microsoft-com:office:word" xmlns:w="http://schemas.openxmlformats.org/wordprocessingml/2006/main" xmlns:w14="http://schemas.microsoft.com/office/word/2010/wordml" xmlns:w15="http://schemas.microsoft.com/office/word/2012/wordml" xmlns:w16cex="http://schemas.microsoft.com/office/word/2018/wordml/cex" xmlns:w16cid="http://schemas.microsoft.com/office/word/2016/wordml/cid" xmlns:w16="http://schemas.microsoft.com/office/word/2018/wordml" xmlns:w16du="http://schemas.microsoft.com/office/word/2023/wordml/word16du" xmlns:w16sdtdh="http://schemas.microsoft.com/office/word/2020/wordml/sdtdatahash" xmlns:w16se="http://schemas.microsoft.com/office/word/2015/wordml/symex" xmlns:wpg="http://schemas.microsoft.com/office/word/2010/wordprocessingGroup" xmlns:wpi="http://schemas.microsoft.com/office/word/2010/wordprocessingInk" xmlns:wne="http://schemas.microsoft.com/office/word/2006/wordml" xmlns:wps="http://schemas.microsoft.com/office/word/2010/wordprocessingShape" mc:Ignorable="w14 w15 w16se w16cid w16 w16cex w16sdtdh w16du wp14">
+<w:footnotes xmlns:wpc="http://schemas.microsoft.com/office/word/2010/wordprocessingCanvas" xmlns:cx="http://schemas.microsoft.com/office/drawing/2014/chartex" xmlns:cx1="http://schemas.microsoft.com/office/drawing/2015/9/8/chartex" xmlns:cx2="http://schemas.microsoft.com/office/drawing/2015/10/21/chartex" xmlns:cx3="http://schemas.microsoft.com/office/drawing/2016/5/9/chartex" xmlns:cx4="http://schemas.microsoft.com/office/drawing/2016/5/10/chartex" xmlns:cx5="http://schemas.microsoft.com/office/drawing/2016/5/11/chartex" xmlns:cx6="http://schemas.microsoft.com/office/drawing/2016/5/12/chartex" xmlns:cx7="http://schemas.microsoft.com/office/drawing/2016/5/13/chartex" xmlns:cx8="http://schemas.microsoft.com/office/drawing/2016/5/14/chartex" xmlns:mc="http://schemas.openxmlformats.org/markup-compatibility/2006" xmlns:aink="http://schemas.microsoft.com/office/drawing/2016/ink" xmlns:am3d="http://schemas.microsoft.com/office/drawing/2017/model3d" xmlns:o="urn:schemas-microsoft-com:office:office" xmlns:oel="http://schemas.microsoft.com/office/2019/extlst" xmlns:r="http://schemas.openxmlformats.org/officeDocument/2006/relationships" xmlns:m="http://schemas.openxmlformats.org/officeDocument/2006/math" xmlns:v="urn:schemas-microsoft-com:vml" xmlns:wp14="http://schemas.microsoft.com/office/word/2010/wordprocessingDrawing" xmlns:wp="http://schemas.openxmlformats.org/drawingml/2006/wordprocessingDrawing" xmlns:w10="urn:schemas-microsoft-com:office:word" xmlns:w="http://schemas.openxmlformats.org/wordprocessingml/2006/main" xmlns:w14="http://schemas.microsoft.com/office/word/2010/wordml" xmlns:w15="http://schemas.microsoft.com/office/word/2012/wordml" xmlns:w16cex="http://schemas.microsoft.com/office/word/2018/wordml/cex" xmlns:w16cid="http://schemas.microsoft.com/office/word/2016/wordml/cid" xmlns:w16="http://schemas.microsoft.com/office/word/2018/wordml" xmlns:w16du="http://schemas.microsoft.com/office/word/2023/wordml/word16du" xmlns:w16sdtdh="http://schemas.microsoft.com/office/word/2020/wordml/sdtdatahash" xmlns:w16sdtfl="http://schemas.microsoft.com/office/word/2024/wordml/sdtformatlock" xmlns:w16se="http://schemas.microsoft.com/office/word/2015/wordml/symex" xmlns:wpg="http://schemas.microsoft.com/office/word/2010/wordprocessingGroup" xmlns:wpi="http://schemas.microsoft.com/office/word/2010/wordprocessingInk" xmlns:wne="http://schemas.microsoft.com/office/word/2006/wordml" xmlns:wps="http://schemas.microsoft.com/office/word/2010/wordprocessingShape" mc:Ignorable="w14 w15 w16se w16cid w16 w16cex w16sdtdh w16sdtfl w16du wp14">
   <w:footnote w:type="separator" w:id="-1">
     <w:p>
       <w:r>
@@ -432,7 +639,7 @@
 </file>
 
 <file path=word/numbering.xml><?xml version="1.0" encoding="utf-8"?>
-<w:numbering xmlns:wpc="http://schemas.microsoft.com/office/word/2010/wordprocessingCanvas" xmlns:cx="http://schemas.microsoft.com/office/drawing/2014/chartex" xmlns:cx1="http://schemas.microsoft.com/office/drawing/2015/9/8/chartex" xmlns:cx2="http://schemas.microsoft.com/office/drawing/2015/10/21/chartex" xmlns:cx3="http://schemas.microsoft.com/office/drawing/2016/5/9/chartex" xmlns:cx4="http://schemas.microsoft.com/office/drawing/2016/5/10/chartex" xmlns:cx5="http://schemas.microsoft.com/office/drawing/2016/5/11/chartex" xmlns:cx6="http://schemas.microsoft.com/office/drawing/2016/5/12/chartex" xmlns:cx7="http://schemas.microsoft.com/office/drawing/2016/5/13/chartex" xmlns:cx8="http://schemas.microsoft.com/office/drawing/2016/5/14/chartex" xmlns:mc="http://schemas.openxmlformats.org/markup-compatibility/2006" xmlns:aink="http://schemas.microsoft.com/office/drawing/2016/ink" xmlns:am3d="http://schemas.microsoft.com/office/drawing/2017/model3d" xmlns:o="urn:schemas-microsoft-com:office:office" xmlns:oel="http://schemas.microsoft.com/office/2019/extlst" xmlns:r="http://schemas.openxmlformats.org/officeDocument/2006/relationships" xmlns:m="http://schemas.openxmlformats.org/officeDocument/2006/math" xmlns:v="urn:schemas-microsoft-com:vml" xmlns:wp14="http://schemas.microsoft.com/office/word/2010/wordprocessingDrawing" xmlns:wp="http://schemas.openxmlformats.org/drawingml/2006/wordprocessingDrawing" xmlns:w10="urn:schemas-microsoft-com:office:word" xmlns:w="http://schemas.openxmlformats.org/wordprocessingml/2006/main" xmlns:w14="http://schemas.microsoft.com/office/word/2010/wordml" xmlns:w15="http://schemas.microsoft.com/office/word/2012/wordml" xmlns:w16cex="http://schemas.microsoft.com/office/word/2018/wordml/cex" xmlns:w16cid="http://schemas.microsoft.com/office/word/2016/wordml/cid" xmlns:w16="http://schemas.microsoft.com/office/word/2018/wordml" xmlns:w16du="http://schemas.microsoft.com/office/word/2023/wordml/word16du" xmlns:w16sdtdh="http://schemas.microsoft.com/office/word/2020/wordml/sdtdatahash" xmlns:w16se="http://schemas.microsoft.com/office/word/2015/wordml/symex" xmlns:wpg="http://schemas.microsoft.com/office/word/2010/wordprocessingGroup" xmlns:wpi="http://schemas.microsoft.com/office/word/2010/wordprocessingInk" xmlns:wne="http://schemas.microsoft.com/office/word/2006/wordml" xmlns:wps="http://schemas.microsoft.com/office/word/2010/wordprocessingShape" mc:Ignorable="w14 w15 w16se w16cid w16 w16cex w16sdtdh w16du wp14">
+<w:numbering xmlns:wpc="http://schemas.microsoft.com/office/word/2010/wordprocessingCanvas" xmlns:cx="http://schemas.microsoft.com/office/drawing/2014/chartex" xmlns:cx1="http://schemas.microsoft.com/office/drawing/2015/9/8/chartex" xmlns:cx2="http://schemas.microsoft.com/office/drawing/2015/10/21/chartex" xmlns:cx3="http://schemas.microsoft.com/office/drawing/2016/5/9/chartex" xmlns:cx4="http://schemas.microsoft.com/office/drawing/2016/5/10/chartex" xmlns:cx5="http://schemas.microsoft.com/office/drawing/2016/5/11/chartex" xmlns:cx6="http://schemas.microsoft.com/office/drawing/2016/5/12/chartex" xmlns:cx7="http://schemas.microsoft.com/office/drawing/2016/5/13/chartex" xmlns:cx8="http://schemas.microsoft.com/office/drawing/2016/5/14/chartex" xmlns:mc="http://schemas.openxmlformats.org/markup-compatibility/2006" xmlns:aink="http://schemas.microsoft.com/office/drawing/2016/ink" xmlns:am3d="http://schemas.microsoft.com/office/drawing/2017/model3d" xmlns:o="urn:schemas-microsoft-com:office:office" xmlns:oel="http://schemas.microsoft.com/office/2019/extlst" xmlns:r="http://schemas.openxmlformats.org/officeDocument/2006/relationships" xmlns:m="http://schemas.openxmlformats.org/officeDocument/2006/math" xmlns:v="urn:schemas-microsoft-com:vml" xmlns:wp14="http://schemas.microsoft.com/office/word/2010/wordprocessingDrawing" xmlns:wp="http://schemas.openxmlformats.org/drawingml/2006/wordprocessingDrawing" xmlns:w10="urn:schemas-microsoft-com:office:word" xmlns:w="http://schemas.openxmlformats.org/wordprocessingml/2006/main" xmlns:w14="http://schemas.microsoft.com/office/word/2010/wordml" xmlns:w15="http://schemas.microsoft.com/office/word/2012/wordml" xmlns:w16cex="http://schemas.microsoft.com/office/word/2018/wordml/cex" xmlns:w16cid="http://schemas.microsoft.com/office/word/2016/wordml/cid" xmlns:w16="http://schemas.microsoft.com/office/word/2018/wordml" xmlns:w16du="http://schemas.microsoft.com/office/word/2023/wordml/word16du" xmlns:w16sdtdh="http://schemas.microsoft.com/office/word/2020/wordml/sdtdatahash" xmlns:w16sdtfl="http://schemas.microsoft.com/office/word/2024/wordml/sdtformatlock" xmlns:w16se="http://schemas.microsoft.com/office/word/2015/wordml/symex" xmlns:wpg="http://schemas.microsoft.com/office/word/2010/wordprocessingGroup" xmlns:wpi="http://schemas.microsoft.com/office/word/2010/wordprocessingInk" xmlns:wne="http://schemas.microsoft.com/office/word/2006/wordml" xmlns:wps="http://schemas.microsoft.com/office/word/2010/wordprocessingShape" mc:Ignorable="w14 w15 w16se w16cid w16 w16cex w16sdtdh w16sdtfl w16du wp14">
   <w:abstractNum w:abstractNumId="0" w15:restartNumberingAfterBreak="0">
     <w:nsid w:val="0000A990"/>
     <w:multiLevelType w:val="multilevel"/>
@@ -585,6 +792,453 @@
       <w:pPr>
         <w:ind w:left="6480" w:hanging="480"/>
       </w:pPr>
+    </w:lvl>
+  </w:abstractNum>
+  <w:abstractNum w:abstractNumId="2" w15:restartNumberingAfterBreak="0">
+    <w:nsid w:val="09595C9B"/>
+    <w:multiLevelType w:val="multilevel"/>
+    <w:tmpl w:val="CCD243BA"/>
+    <w:lvl w:ilvl="0">
+      <w:start w:val="1"/>
+      <w:numFmt w:val="bullet"/>
+      <w:lvlText w:val=""/>
+      <w:lvlJc w:val="left"/>
+      <w:pPr>
+        <w:tabs>
+          <w:tab w:val="num" w:pos="720"/>
+        </w:tabs>
+        <w:ind w:left="720" w:hanging="360"/>
+      </w:pPr>
+      <w:rPr>
+        <w:rFonts w:ascii="Symbol" w:hAnsi="Symbol" w:hint="default"/>
+        <w:sz w:val="20"/>
+      </w:rPr>
+    </w:lvl>
+    <w:lvl w:ilvl="1" w:tentative="1">
+      <w:start w:val="1"/>
+      <w:numFmt w:val="bullet"/>
+      <w:lvlText w:val="o"/>
+      <w:lvlJc w:val="left"/>
+      <w:pPr>
+        <w:tabs>
+          <w:tab w:val="num" w:pos="1440"/>
+        </w:tabs>
+        <w:ind w:left="1440" w:hanging="360"/>
+      </w:pPr>
+      <w:rPr>
+        <w:rFonts w:ascii="Courier New" w:hAnsi="Courier New" w:hint="default"/>
+        <w:sz w:val="20"/>
+      </w:rPr>
+    </w:lvl>
+    <w:lvl w:ilvl="2" w:tentative="1">
+      <w:start w:val="1"/>
+      <w:numFmt w:val="bullet"/>
+      <w:lvlText w:val=""/>
+      <w:lvlJc w:val="left"/>
+      <w:pPr>
+        <w:tabs>
+          <w:tab w:val="num" w:pos="2160"/>
+        </w:tabs>
+        <w:ind w:left="2160" w:hanging="360"/>
+      </w:pPr>
+      <w:rPr>
+        <w:rFonts w:ascii="Wingdings" w:hAnsi="Wingdings" w:hint="default"/>
+        <w:sz w:val="20"/>
+      </w:rPr>
+    </w:lvl>
+    <w:lvl w:ilvl="3" w:tentative="1">
+      <w:start w:val="1"/>
+      <w:numFmt w:val="bullet"/>
+      <w:lvlText w:val=""/>
+      <w:lvlJc w:val="left"/>
+      <w:pPr>
+        <w:tabs>
+          <w:tab w:val="num" w:pos="2880"/>
+        </w:tabs>
+        <w:ind w:left="2880" w:hanging="360"/>
+      </w:pPr>
+      <w:rPr>
+        <w:rFonts w:ascii="Wingdings" w:hAnsi="Wingdings" w:hint="default"/>
+        <w:sz w:val="20"/>
+      </w:rPr>
+    </w:lvl>
+    <w:lvl w:ilvl="4" w:tentative="1">
+      <w:start w:val="1"/>
+      <w:numFmt w:val="bullet"/>
+      <w:lvlText w:val=""/>
+      <w:lvlJc w:val="left"/>
+      <w:pPr>
+        <w:tabs>
+          <w:tab w:val="num" w:pos="3600"/>
+        </w:tabs>
+        <w:ind w:left="3600" w:hanging="360"/>
+      </w:pPr>
+      <w:rPr>
+        <w:rFonts w:ascii="Wingdings" w:hAnsi="Wingdings" w:hint="default"/>
+        <w:sz w:val="20"/>
+      </w:rPr>
+    </w:lvl>
+    <w:lvl w:ilvl="5" w:tentative="1">
+      <w:start w:val="1"/>
+      <w:numFmt w:val="bullet"/>
+      <w:lvlText w:val=""/>
+      <w:lvlJc w:val="left"/>
+      <w:pPr>
+        <w:tabs>
+          <w:tab w:val="num" w:pos="4320"/>
+        </w:tabs>
+        <w:ind w:left="4320" w:hanging="360"/>
+      </w:pPr>
+      <w:rPr>
+        <w:rFonts w:ascii="Wingdings" w:hAnsi="Wingdings" w:hint="default"/>
+        <w:sz w:val="20"/>
+      </w:rPr>
+    </w:lvl>
+    <w:lvl w:ilvl="6" w:tentative="1">
+      <w:start w:val="1"/>
+      <w:numFmt w:val="bullet"/>
+      <w:lvlText w:val=""/>
+      <w:lvlJc w:val="left"/>
+      <w:pPr>
+        <w:tabs>
+          <w:tab w:val="num" w:pos="5040"/>
+        </w:tabs>
+        <w:ind w:left="5040" w:hanging="360"/>
+      </w:pPr>
+      <w:rPr>
+        <w:rFonts w:ascii="Wingdings" w:hAnsi="Wingdings" w:hint="default"/>
+        <w:sz w:val="20"/>
+      </w:rPr>
+    </w:lvl>
+    <w:lvl w:ilvl="7" w:tentative="1">
+      <w:start w:val="1"/>
+      <w:numFmt w:val="bullet"/>
+      <w:lvlText w:val=""/>
+      <w:lvlJc w:val="left"/>
+      <w:pPr>
+        <w:tabs>
+          <w:tab w:val="num" w:pos="5760"/>
+        </w:tabs>
+        <w:ind w:left="5760" w:hanging="360"/>
+      </w:pPr>
+      <w:rPr>
+        <w:rFonts w:ascii="Wingdings" w:hAnsi="Wingdings" w:hint="default"/>
+        <w:sz w:val="20"/>
+      </w:rPr>
+    </w:lvl>
+    <w:lvl w:ilvl="8" w:tentative="1">
+      <w:start w:val="1"/>
+      <w:numFmt w:val="bullet"/>
+      <w:lvlText w:val=""/>
+      <w:lvlJc w:val="left"/>
+      <w:pPr>
+        <w:tabs>
+          <w:tab w:val="num" w:pos="6480"/>
+        </w:tabs>
+        <w:ind w:left="6480" w:hanging="360"/>
+      </w:pPr>
+      <w:rPr>
+        <w:rFonts w:ascii="Wingdings" w:hAnsi="Wingdings" w:hint="default"/>
+        <w:sz w:val="20"/>
+      </w:rPr>
+    </w:lvl>
+  </w:abstractNum>
+  <w:abstractNum w:abstractNumId="3" w15:restartNumberingAfterBreak="0">
+    <w:nsid w:val="62163C10"/>
+    <w:multiLevelType w:val="multilevel"/>
+    <w:tmpl w:val="CD1AD91E"/>
+    <w:lvl w:ilvl="0">
+      <w:start w:val="1"/>
+      <w:numFmt w:val="bullet"/>
+      <w:lvlText w:val=""/>
+      <w:lvlJc w:val="left"/>
+      <w:pPr>
+        <w:tabs>
+          <w:tab w:val="num" w:pos="720"/>
+        </w:tabs>
+        <w:ind w:left="720" w:hanging="360"/>
+      </w:pPr>
+      <w:rPr>
+        <w:rFonts w:ascii="Symbol" w:hAnsi="Symbol" w:hint="default"/>
+        <w:sz w:val="20"/>
+      </w:rPr>
+    </w:lvl>
+    <w:lvl w:ilvl="1" w:tentative="1">
+      <w:start w:val="1"/>
+      <w:numFmt w:val="bullet"/>
+      <w:lvlText w:val="o"/>
+      <w:lvlJc w:val="left"/>
+      <w:pPr>
+        <w:tabs>
+          <w:tab w:val="num" w:pos="1440"/>
+        </w:tabs>
+        <w:ind w:left="1440" w:hanging="360"/>
+      </w:pPr>
+      <w:rPr>
+        <w:rFonts w:ascii="Courier New" w:hAnsi="Courier New" w:hint="default"/>
+        <w:sz w:val="20"/>
+      </w:rPr>
+    </w:lvl>
+    <w:lvl w:ilvl="2" w:tentative="1">
+      <w:start w:val="1"/>
+      <w:numFmt w:val="bullet"/>
+      <w:lvlText w:val=""/>
+      <w:lvlJc w:val="left"/>
+      <w:pPr>
+        <w:tabs>
+          <w:tab w:val="num" w:pos="2160"/>
+        </w:tabs>
+        <w:ind w:left="2160" w:hanging="360"/>
+      </w:pPr>
+      <w:rPr>
+        <w:rFonts w:ascii="Wingdings" w:hAnsi="Wingdings" w:hint="default"/>
+        <w:sz w:val="20"/>
+      </w:rPr>
+    </w:lvl>
+    <w:lvl w:ilvl="3" w:tentative="1">
+      <w:start w:val="1"/>
+      <w:numFmt w:val="bullet"/>
+      <w:lvlText w:val=""/>
+      <w:lvlJc w:val="left"/>
+      <w:pPr>
+        <w:tabs>
+          <w:tab w:val="num" w:pos="2880"/>
+        </w:tabs>
+        <w:ind w:left="2880" w:hanging="360"/>
+      </w:pPr>
+      <w:rPr>
+        <w:rFonts w:ascii="Wingdings" w:hAnsi="Wingdings" w:hint="default"/>
+        <w:sz w:val="20"/>
+      </w:rPr>
+    </w:lvl>
+    <w:lvl w:ilvl="4" w:tentative="1">
+      <w:start w:val="1"/>
+      <w:numFmt w:val="bullet"/>
+      <w:lvlText w:val=""/>
+      <w:lvlJc w:val="left"/>
+      <w:pPr>
+        <w:tabs>
+          <w:tab w:val="num" w:pos="3600"/>
+        </w:tabs>
+        <w:ind w:left="3600" w:hanging="360"/>
+      </w:pPr>
+      <w:rPr>
+        <w:rFonts w:ascii="Wingdings" w:hAnsi="Wingdings" w:hint="default"/>
+        <w:sz w:val="20"/>
+      </w:rPr>
+    </w:lvl>
+    <w:lvl w:ilvl="5" w:tentative="1">
+      <w:start w:val="1"/>
+      <w:numFmt w:val="bullet"/>
+      <w:lvlText w:val=""/>
+      <w:lvlJc w:val="left"/>
+      <w:pPr>
+        <w:tabs>
+          <w:tab w:val="num" w:pos="4320"/>
+        </w:tabs>
+        <w:ind w:left="4320" w:hanging="360"/>
+      </w:pPr>
+      <w:rPr>
+        <w:rFonts w:ascii="Wingdings" w:hAnsi="Wingdings" w:hint="default"/>
+        <w:sz w:val="20"/>
+      </w:rPr>
+    </w:lvl>
+    <w:lvl w:ilvl="6" w:tentative="1">
+      <w:start w:val="1"/>
+      <w:numFmt w:val="bullet"/>
+      <w:lvlText w:val=""/>
+      <w:lvlJc w:val="left"/>
+      <w:pPr>
+        <w:tabs>
+          <w:tab w:val="num" w:pos="5040"/>
+        </w:tabs>
+        <w:ind w:left="5040" w:hanging="360"/>
+      </w:pPr>
+      <w:rPr>
+        <w:rFonts w:ascii="Wingdings" w:hAnsi="Wingdings" w:hint="default"/>
+        <w:sz w:val="20"/>
+      </w:rPr>
+    </w:lvl>
+    <w:lvl w:ilvl="7" w:tentative="1">
+      <w:start w:val="1"/>
+      <w:numFmt w:val="bullet"/>
+      <w:lvlText w:val=""/>
+      <w:lvlJc w:val="left"/>
+      <w:pPr>
+        <w:tabs>
+          <w:tab w:val="num" w:pos="5760"/>
+        </w:tabs>
+        <w:ind w:left="5760" w:hanging="360"/>
+      </w:pPr>
+      <w:rPr>
+        <w:rFonts w:ascii="Wingdings" w:hAnsi="Wingdings" w:hint="default"/>
+        <w:sz w:val="20"/>
+      </w:rPr>
+    </w:lvl>
+    <w:lvl w:ilvl="8" w:tentative="1">
+      <w:start w:val="1"/>
+      <w:numFmt w:val="bullet"/>
+      <w:lvlText w:val=""/>
+      <w:lvlJc w:val="left"/>
+      <w:pPr>
+        <w:tabs>
+          <w:tab w:val="num" w:pos="6480"/>
+        </w:tabs>
+        <w:ind w:left="6480" w:hanging="360"/>
+      </w:pPr>
+      <w:rPr>
+        <w:rFonts w:ascii="Wingdings" w:hAnsi="Wingdings" w:hint="default"/>
+        <w:sz w:val="20"/>
+      </w:rPr>
+    </w:lvl>
+  </w:abstractNum>
+  <w:abstractNum w:abstractNumId="4" w15:restartNumberingAfterBreak="0">
+    <w:nsid w:val="687E69B7"/>
+    <w:multiLevelType w:val="multilevel"/>
+    <w:tmpl w:val="A45A9CAA"/>
+    <w:lvl w:ilvl="0">
+      <w:start w:val="1"/>
+      <w:numFmt w:val="bullet"/>
+      <w:lvlText w:val=""/>
+      <w:lvlJc w:val="left"/>
+      <w:pPr>
+        <w:tabs>
+          <w:tab w:val="num" w:pos="720"/>
+        </w:tabs>
+        <w:ind w:left="720" w:hanging="360"/>
+      </w:pPr>
+      <w:rPr>
+        <w:rFonts w:ascii="Symbol" w:hAnsi="Symbol" w:hint="default"/>
+        <w:sz w:val="20"/>
+      </w:rPr>
+    </w:lvl>
+    <w:lvl w:ilvl="1" w:tentative="1">
+      <w:start w:val="1"/>
+      <w:numFmt w:val="bullet"/>
+      <w:lvlText w:val="o"/>
+      <w:lvlJc w:val="left"/>
+      <w:pPr>
+        <w:tabs>
+          <w:tab w:val="num" w:pos="1440"/>
+        </w:tabs>
+        <w:ind w:left="1440" w:hanging="360"/>
+      </w:pPr>
+      <w:rPr>
+        <w:rFonts w:ascii="Courier New" w:hAnsi="Courier New" w:hint="default"/>
+        <w:sz w:val="20"/>
+      </w:rPr>
+    </w:lvl>
+    <w:lvl w:ilvl="2" w:tentative="1">
+      <w:start w:val="1"/>
+      <w:numFmt w:val="bullet"/>
+      <w:lvlText w:val=""/>
+      <w:lvlJc w:val="left"/>
+      <w:pPr>
+        <w:tabs>
+          <w:tab w:val="num" w:pos="2160"/>
+        </w:tabs>
+        <w:ind w:left="2160" w:hanging="360"/>
+      </w:pPr>
+      <w:rPr>
+        <w:rFonts w:ascii="Wingdings" w:hAnsi="Wingdings" w:hint="default"/>
+        <w:sz w:val="20"/>
+      </w:rPr>
+    </w:lvl>
+    <w:lvl w:ilvl="3" w:tentative="1">
+      <w:start w:val="1"/>
+      <w:numFmt w:val="bullet"/>
+      <w:lvlText w:val=""/>
+      <w:lvlJc w:val="left"/>
+      <w:pPr>
+        <w:tabs>
+          <w:tab w:val="num" w:pos="2880"/>
+        </w:tabs>
+        <w:ind w:left="2880" w:hanging="360"/>
+      </w:pPr>
+      <w:rPr>
+        <w:rFonts w:ascii="Wingdings" w:hAnsi="Wingdings" w:hint="default"/>
+        <w:sz w:val="20"/>
+      </w:rPr>
+    </w:lvl>
+    <w:lvl w:ilvl="4" w:tentative="1">
+      <w:start w:val="1"/>
+      <w:numFmt w:val="bullet"/>
+      <w:lvlText w:val=""/>
+      <w:lvlJc w:val="left"/>
+      <w:pPr>
+        <w:tabs>
+          <w:tab w:val="num" w:pos="3600"/>
+        </w:tabs>
+        <w:ind w:left="3600" w:hanging="360"/>
+      </w:pPr>
+      <w:rPr>
+        <w:rFonts w:ascii="Wingdings" w:hAnsi="Wingdings" w:hint="default"/>
+        <w:sz w:val="20"/>
+      </w:rPr>
+    </w:lvl>
+    <w:lvl w:ilvl="5" w:tentative="1">
+      <w:start w:val="1"/>
+      <w:numFmt w:val="bullet"/>
+      <w:lvlText w:val=""/>
+      <w:lvlJc w:val="left"/>
+      <w:pPr>
+        <w:tabs>
+          <w:tab w:val="num" w:pos="4320"/>
+        </w:tabs>
+        <w:ind w:left="4320" w:hanging="360"/>
+      </w:pPr>
+      <w:rPr>
+        <w:rFonts w:ascii="Wingdings" w:hAnsi="Wingdings" w:hint="default"/>
+        <w:sz w:val="20"/>
+      </w:rPr>
+    </w:lvl>
+    <w:lvl w:ilvl="6" w:tentative="1">
+      <w:start w:val="1"/>
+      <w:numFmt w:val="bullet"/>
+      <w:lvlText w:val=""/>
+      <w:lvlJc w:val="left"/>
+      <w:pPr>
+        <w:tabs>
+          <w:tab w:val="num" w:pos="5040"/>
+        </w:tabs>
+        <w:ind w:left="5040" w:hanging="360"/>
+      </w:pPr>
+      <w:rPr>
+        <w:rFonts w:ascii="Wingdings" w:hAnsi="Wingdings" w:hint="default"/>
+        <w:sz w:val="20"/>
+      </w:rPr>
+    </w:lvl>
+    <w:lvl w:ilvl="7" w:tentative="1">
+      <w:start w:val="1"/>
+      <w:numFmt w:val="bullet"/>
+      <w:lvlText w:val=""/>
+      <w:lvlJc w:val="left"/>
+      <w:pPr>
+        <w:tabs>
+          <w:tab w:val="num" w:pos="5760"/>
+        </w:tabs>
+        <w:ind w:left="5760" w:hanging="360"/>
+      </w:pPr>
+      <w:rPr>
+        <w:rFonts w:ascii="Wingdings" w:hAnsi="Wingdings" w:hint="default"/>
+        <w:sz w:val="20"/>
+      </w:rPr>
+    </w:lvl>
+    <w:lvl w:ilvl="8" w:tentative="1">
+      <w:start w:val="1"/>
+      <w:numFmt w:val="bullet"/>
+      <w:lvlText w:val=""/>
+      <w:lvlJc w:val="left"/>
+      <w:pPr>
+        <w:tabs>
+          <w:tab w:val="num" w:pos="6480"/>
+        </w:tabs>
+        <w:ind w:left="6480" w:hanging="360"/>
+      </w:pPr>
+      <w:rPr>
+        <w:rFonts w:ascii="Wingdings" w:hAnsi="Wingdings" w:hint="default"/>
+        <w:sz w:val="20"/>
+      </w:rPr>
     </w:lvl>
   </w:abstractNum>
   <w:num w:numId="1" w16cid:durableId="996496520">
@@ -593,11 +1247,20 @@
   <w:num w:numId="2" w16cid:durableId="377366250">
     <w:abstractNumId w:val="1"/>
   </w:num>
+  <w:num w:numId="3" w16cid:durableId="1518302201">
+    <w:abstractNumId w:val="2"/>
+  </w:num>
+  <w:num w:numId="4" w16cid:durableId="1664622259">
+    <w:abstractNumId w:val="4"/>
+  </w:num>
+  <w:num w:numId="5" w16cid:durableId="1833401807">
+    <w:abstractNumId w:val="3"/>
+  </w:num>
 </w:numbering>
 </file>
 
 <file path=word/styles.xml><?xml version="1.0" encoding="utf-8"?>
-<w:styles xmlns:mc="http://schemas.openxmlformats.org/markup-compatibility/2006" xmlns:r="http://schemas.openxmlformats.org/officeDocument/2006/relationships" xmlns:w="http://schemas.openxmlformats.org/wordprocessingml/2006/main" xmlns:w14="http://schemas.microsoft.com/office/word/2010/wordml" xmlns:w15="http://schemas.microsoft.com/office/word/2012/wordml" xmlns:w16cex="http://schemas.microsoft.com/office/word/2018/wordml/cex" xmlns:w16cid="http://schemas.microsoft.com/office/word/2016/wordml/cid" xmlns:w16="http://schemas.microsoft.com/office/word/2018/wordml" xmlns:w16du="http://schemas.microsoft.com/office/word/2023/wordml/word16du" xmlns:w16sdtdh="http://schemas.microsoft.com/office/word/2020/wordml/sdtdatahash" xmlns:w16se="http://schemas.microsoft.com/office/word/2015/wordml/symex" mc:Ignorable="w14 w15 w16se w16cid w16 w16cex w16sdtdh w16du">
+<w:styles xmlns:mc="http://schemas.openxmlformats.org/markup-compatibility/2006" xmlns:r="http://schemas.openxmlformats.org/officeDocument/2006/relationships" xmlns:w="http://schemas.openxmlformats.org/wordprocessingml/2006/main" xmlns:w14="http://schemas.microsoft.com/office/word/2010/wordml" xmlns:w15="http://schemas.microsoft.com/office/word/2012/wordml" xmlns:w16cex="http://schemas.microsoft.com/office/word/2018/wordml/cex" xmlns:w16cid="http://schemas.microsoft.com/office/word/2016/wordml/cid" xmlns:w16="http://schemas.microsoft.com/office/word/2018/wordml" xmlns:w16du="http://schemas.microsoft.com/office/word/2023/wordml/word16du" xmlns:w16sdtdh="http://schemas.microsoft.com/office/word/2020/wordml/sdtdatahash" xmlns:w16sdtfl="http://schemas.microsoft.com/office/word/2024/wordml/sdtformatlock" xmlns:w16se="http://schemas.microsoft.com/office/word/2015/wordml/symex" mc:Ignorable="w14 w15 w16se w16cid w16 w16cex w16sdtdh w16sdtfl w16du">
   <w:docDefaults>
     <w:rPrDefault>
       <w:rPr>
@@ -614,6 +1277,7 @@
     </w:pPrDefault>
   </w:docDefaults>
   <w:latentStyles w:defLockedState="0" w:defUIPriority="0" w:defSemiHidden="0" w:defUnhideWhenUsed="0" w:defQFormat="0" w:count="376">
+    <w:lsdException w:name="Normal (Web)" w:uiPriority="99"/>
     <w:lsdException w:name="Normal Table" w:semiHidden="1" w:unhideWhenUsed="1"/>
     <w:lsdException w:name="Table Simple 1" w:semiHidden="1" w:unhideWhenUsed="1"/>
     <w:lsdException w:name="Table Simple 2" w:semiHidden="1" w:unhideWhenUsed="1"/>
@@ -865,6 +1529,7 @@
     <w:name w:val="heading 1"/>
     <w:basedOn w:val="Normal"/>
     <w:next w:val="BodyText"/>
+    <w:link w:val="Heading1Char"/>
     <w:uiPriority w:val="9"/>
     <w:qFormat/>
     <w:pPr>
@@ -1038,7 +1703,6 @@
   <w:style w:type="character" w:default="1" w:styleId="DefaultParagraphFont">
     <w:name w:val="Default Paragraph Font"/>
     <w:uiPriority w:val="1"/>
-    <w:semiHidden/>
     <w:unhideWhenUsed/>
   </w:style>
   <w:style w:type="table" w:default="1" w:styleId="TableNormal">
@@ -1619,6 +2283,183 @@
     <w:rPr>
       <w:rFonts w:ascii="Consolas" w:hAnsi="Consolas"/>
       <w:sz w:val="22"/>
+    </w:rPr>
+  </w:style>
+  <w:style w:type="character" w:styleId="BookTitle">
+    <w:name w:val="Book Title"/>
+    <w:basedOn w:val="DefaultParagraphFont"/>
+    <w:rsid w:val="00CE2BE2"/>
+    <w:rPr>
+      <w:b/>
+      <w:bCs/>
+      <w:i/>
+      <w:iCs/>
+      <w:spacing w:val="5"/>
+    </w:rPr>
+  </w:style>
+  <w:style w:type="character" w:styleId="Emphasis">
+    <w:name w:val="Emphasis"/>
+    <w:basedOn w:val="DefaultParagraphFont"/>
+    <w:rsid w:val="00CE2BE2"/>
+    <w:rPr>
+      <w:i/>
+      <w:iCs/>
+    </w:rPr>
+  </w:style>
+  <w:style w:type="character" w:styleId="IntenseEmphasis">
+    <w:name w:val="Intense Emphasis"/>
+    <w:basedOn w:val="DefaultParagraphFont"/>
+    <w:rsid w:val="00CE2BE2"/>
+    <w:rPr>
+      <w:i/>
+      <w:iCs/>
+      <w:color w:val="4F81BD" w:themeColor="accent1"/>
+    </w:rPr>
+  </w:style>
+  <w:style w:type="paragraph" w:styleId="IntenseQuote">
+    <w:name w:val="Intense Quote"/>
+    <w:basedOn w:val="Normal"/>
+    <w:next w:val="Normal"/>
+    <w:link w:val="IntenseQuoteChar"/>
+    <w:rsid w:val="00CE2BE2"/>
+    <w:pPr>
+      <w:pBdr>
+        <w:top w:val="single" w:sz="4" w:space="10" w:color="4F81BD" w:themeColor="accent1"/>
+        <w:bottom w:val="single" w:sz="4" w:space="10" w:color="4F81BD" w:themeColor="accent1"/>
+      </w:pBdr>
+      <w:spacing w:before="360" w:after="360"/>
+      <w:ind w:left="864" w:right="864"/>
+      <w:jc w:val="center"/>
+    </w:pPr>
+    <w:rPr>
+      <w:i/>
+      <w:iCs/>
+      <w:color w:val="4F81BD" w:themeColor="accent1"/>
+    </w:rPr>
+  </w:style>
+  <w:style w:type="character" w:customStyle="1" w:styleId="IntenseQuoteChar">
+    <w:name w:val="Intense Quote Char"/>
+    <w:basedOn w:val="DefaultParagraphFont"/>
+    <w:link w:val="IntenseQuote"/>
+    <w:rsid w:val="00CE2BE2"/>
+    <w:rPr>
+      <w:i/>
+      <w:iCs/>
+      <w:color w:val="4F81BD" w:themeColor="accent1"/>
+    </w:rPr>
+  </w:style>
+  <w:style w:type="character" w:styleId="IntenseReference">
+    <w:name w:val="Intense Reference"/>
+    <w:basedOn w:val="DefaultParagraphFont"/>
+    <w:rsid w:val="00CE2BE2"/>
+    <w:rPr>
+      <w:b/>
+      <w:bCs/>
+      <w:smallCaps/>
+      <w:color w:val="4F81BD" w:themeColor="accent1"/>
+      <w:spacing w:val="5"/>
+    </w:rPr>
+  </w:style>
+  <w:style w:type="paragraph" w:styleId="ListParagraph">
+    <w:name w:val="List Paragraph"/>
+    <w:basedOn w:val="Normal"/>
+    <w:rsid w:val="00CE2BE2"/>
+    <w:pPr>
+      <w:ind w:left="720"/>
+      <w:contextualSpacing/>
+    </w:pPr>
+  </w:style>
+  <w:style w:type="paragraph" w:styleId="NoSpacing">
+    <w:name w:val="No Spacing"/>
+    <w:rsid w:val="00CE2BE2"/>
+    <w:pPr>
+      <w:spacing w:after="0"/>
+    </w:pPr>
+  </w:style>
+  <w:style w:type="paragraph" w:styleId="Quote">
+    <w:name w:val="Quote"/>
+    <w:basedOn w:val="Normal"/>
+    <w:next w:val="Normal"/>
+    <w:link w:val="QuoteChar"/>
+    <w:rsid w:val="00CE2BE2"/>
+    <w:pPr>
+      <w:spacing w:before="200" w:after="160"/>
+      <w:ind w:left="864" w:right="864"/>
+      <w:jc w:val="center"/>
+    </w:pPr>
+    <w:rPr>
+      <w:i/>
+      <w:iCs/>
+      <w:color w:val="404040" w:themeColor="text1" w:themeTint="BF"/>
+    </w:rPr>
+  </w:style>
+  <w:style w:type="character" w:customStyle="1" w:styleId="QuoteChar">
+    <w:name w:val="Quote Char"/>
+    <w:basedOn w:val="DefaultParagraphFont"/>
+    <w:link w:val="Quote"/>
+    <w:rsid w:val="00CE2BE2"/>
+    <w:rPr>
+      <w:i/>
+      <w:iCs/>
+      <w:color w:val="404040" w:themeColor="text1" w:themeTint="BF"/>
+    </w:rPr>
+  </w:style>
+  <w:style w:type="character" w:styleId="Strong">
+    <w:name w:val="Strong"/>
+    <w:basedOn w:val="DefaultParagraphFont"/>
+    <w:rsid w:val="00CE2BE2"/>
+    <w:rPr>
+      <w:b/>
+      <w:bCs/>
+    </w:rPr>
+  </w:style>
+  <w:style w:type="character" w:styleId="SubtleEmphasis">
+    <w:name w:val="Subtle Emphasis"/>
+    <w:basedOn w:val="DefaultParagraphFont"/>
+    <w:rsid w:val="00CE2BE2"/>
+    <w:rPr>
+      <w:i/>
+      <w:iCs/>
+      <w:color w:val="404040" w:themeColor="text1" w:themeTint="BF"/>
+    </w:rPr>
+  </w:style>
+  <w:style w:type="character" w:styleId="SubtleReference">
+    <w:name w:val="Subtle Reference"/>
+    <w:basedOn w:val="DefaultParagraphFont"/>
+    <w:rsid w:val="00CE2BE2"/>
+    <w:rPr>
+      <w:smallCaps/>
+      <w:color w:val="5A5A5A" w:themeColor="text1" w:themeTint="A5"/>
+    </w:rPr>
+  </w:style>
+  <w:style w:type="paragraph" w:styleId="NormalWeb">
+    <w:name w:val="Normal (Web)"/>
+    <w:basedOn w:val="Normal"/>
+    <w:uiPriority w:val="99"/>
+    <w:unhideWhenUsed/>
+    <w:rsid w:val="00CE2BE2"/>
+    <w:pPr>
+      <w:spacing w:before="100" w:beforeAutospacing="1" w:after="100" w:afterAutospacing="1"/>
+    </w:pPr>
+    <w:rPr>
+      <w:rFonts w:ascii="Times New Roman" w:hAnsi="Times New Roman" w:cs="Times New Roman"/>
+      <w:kern w:val="2"/>
+      <w:lang w:val="en-PH" w:eastAsia="en-PH"/>
+      <w14:ligatures w14:val="standardContextual"/>
+    </w:rPr>
+  </w:style>
+  <w:style w:type="character" w:customStyle="1" w:styleId="Heading1Char">
+    <w:name w:val="Heading 1 Char"/>
+    <w:basedOn w:val="DefaultParagraphFont"/>
+    <w:link w:val="Heading1"/>
+    <w:uiPriority w:val="9"/>
+    <w:rPr>
+      <w:rFonts w:asciiTheme="majorHAnsi" w:eastAsiaTheme="majorEastAsia" w:hAnsiTheme="majorHAnsi" w:cstheme="majorBidi"/>
+      <w:b/>
+      <w:bCs/>
+      <w:color w:val="4F81BD" w:themeColor="accent1"/>
+      <w:sz w:val="32"/>
+      <w:szCs w:val="32"/>
     </w:rPr>
   </w:style>
 </w:styles>

</xml_diff>